<commit_message>
Refresh project log: build, testing, and data locations
</commit_message>
<xml_diff>
--- a/docs/PROJECT_LOG.docx
+++ b/docs/PROJECT_LOG.docx
@@ -1136,6 +1136,11 @@
         <w:t>8. Produced so far</w:t>
       </w:r>
     </w:p>
+    <w:p>
+      <w:r>
+        <w:t>The scope decision was taken: label on headline plus standfirst, and narrow the rubric to say so explicitly, rather than applying a full-article rubric to 220 characters and hoping nobody checks.</w:t>
+      </w:r>
+    </w:p>
     <w:tbl>
       <w:tblPr>
         <w:tblStyle w:val="TableGrid"/>
@@ -1149,7 +1154,7 @@
       <w:tr>
         <w:tc>
           <w:tcPr>
-            <w:tcW w:type="dxa" w:w="3024"/>
+            <w:tcW w:type="dxa" w:w="2448"/>
           </w:tcPr>
           <w:p>
             <w:r>
@@ -1163,7 +1168,7 @@
         </w:tc>
         <w:tc>
           <w:tcPr>
-            <w:tcW w:type="dxa" w:w="5904"/>
+            <w:tcW w:type="dxa" w:w="6480"/>
           </w:tcPr>
           <w:p>
             <w:r>
@@ -1179,7 +1184,7 @@
       <w:tr>
         <w:tc>
           <w:tcPr>
-            <w:tcW w:type="dxa" w:w="3024"/>
+            <w:tcW w:type="dxa" w:w="2448"/>
           </w:tcPr>
           <w:p>
             <w:r>
@@ -1192,14 +1197,14 @@
         </w:tc>
         <w:tc>
           <w:tcPr>
-            <w:tcW w:type="dxa" w:w="5904"/>
+            <w:tcW w:type="dxa" w:w="6480"/>
           </w:tcPr>
           <w:p>
             <w:r>
               <w:rPr>
                 <w:sz w:val="18"/>
               </w:rPr>
-              <w:t>The label definition. Chosen definition, the schema, three class definitions, nine decision rules for the cases that actually decide the number, confidence bands, entity-selection test, annotation protocol, stated limits, and the labelling prompt derived from the rules.</w:t>
+              <w:t>The label definition, version v1.0-headline-standfirst. Chosen definition, schema, three class definitions, nine decision rules, confidence bands, entity-selection test, annotation protocol and stated limits. Opens by stating exactly what the labeller sees.</w:t>
             </w:r>
           </w:p>
         </w:tc>
@@ -1207,27 +1212,27 @@
       <w:tr>
         <w:tc>
           <w:tcPr>
-            <w:tcW w:type="dxa" w:w="3024"/>
+            <w:tcW w:type="dxa" w:w="2448"/>
           </w:tcPr>
           <w:p>
             <w:r>
               <w:rPr>
                 <w:sz w:val="18"/>
               </w:rPr>
-              <w:t>docs\README-sentiment-section.md</w:t>
+              <w:t>store.py</w:t>
             </w:r>
           </w:p>
         </w:tc>
         <w:tc>
           <w:tcPr>
-            <w:tcW w:type="dxa" w:w="5904"/>
+            <w:tcW w:type="dxa" w:w="6480"/>
           </w:tcPr>
           <w:p>
             <w:r>
               <w:rPr>
                 <w:sz w:val="18"/>
               </w:rPr>
-              <w:t>Drop-in README section: the definition in brief, the agreement table ready for real numbers, and the argument against off-the-shelf models.</w:t>
+              <w:t>SQLite corpus — articles, labels, and a run audit table. Model and human labels coexist per (article, entity) because labeller is part of the primary key, which is what the agreement measurement needs. Also exports the three scoring CSVs.</w:t>
             </w:r>
           </w:p>
         </w:tc>
@@ -1235,7 +1240,63 @@
       <w:tr>
         <w:tc>
           <w:tcPr>
-            <w:tcW w:type="dxa" w:w="3024"/>
+            <w:tcW w:type="dxa" w:w="2448"/>
+          </w:tcPr>
+          <w:p>
+            <w:r>
+              <w:rPr>
+                <w:sz w:val="18"/>
+              </w:rPr>
+              <w:t>label.py</w:t>
+            </w:r>
+          </w:p>
+        </w:tc>
+        <w:tc>
+          <w:tcPr>
+            <w:tcW w:type="dxa" w:w="6480"/>
+          </w:tcPr>
+          <w:p>
+            <w:r>
+              <w:rPr>
+                <w:sz w:val="18"/>
+              </w:rPr>
+              <w:t>LLM labeller. claude-opus-5, adaptive thinking, structured output pinned to the schema. Handles refusals explicitly and records every attempt.</w:t>
+            </w:r>
+          </w:p>
+        </w:tc>
+      </w:tr>
+      <w:tr>
+        <w:tc>
+          <w:tcPr>
+            <w:tcW w:type="dxa" w:w="2448"/>
+          </w:tcPr>
+          <w:p>
+            <w:r>
+              <w:rPr>
+                <w:sz w:val="18"/>
+              </w:rPr>
+              <w:t>handcheck.py</w:t>
+            </w:r>
+          </w:p>
+        </w:tc>
+        <w:tc>
+          <w:tcPr>
+            <w:tcW w:type="dxa" w:w="6480"/>
+          </w:tcPr>
+          <w:p>
+            <w:r>
+              <w:rPr>
+                <w:sz w:val="18"/>
+              </w:rPr>
+              <w:t>Blind adjudication CLI. Shows headline, standfirst and entity; hides the model's tone, confidence and evidence. Resumable on a fixed seed.</w:t>
+            </w:r>
+          </w:p>
+        </w:tc>
+      </w:tr>
+      <w:tr>
+        <w:tc>
+          <w:tcPr>
+            <w:tcW w:type="dxa" w:w="2448"/>
           </w:tcPr>
           <w:p>
             <w:r>
@@ -1248,14 +1309,14 @@
         </w:tc>
         <w:tc>
           <w:tcPr>
-            <w:tcW w:type="dxa" w:w="5904"/>
+            <w:tcW w:type="dxa" w:w="6480"/>
           </w:tcPr>
           <w:p>
             <w:r>
               <w:rPr>
                 <w:sz w:val="18"/>
               </w:rPr>
-              <w:t>Scorer. Raw agreement, Cohen's κ, 3×3 confusion matrix, per-class agreement, agreement by confidence band, prior re-weighting, and a disagreement listing with direction.</w:t>
+              <w:t>Scorer. Raw agreement, Cohen's κ, 3×3 confusion matrix, per-class agreement, agreement by confidence band, corpus-prior re-weighting, and a disagreement listing with direction.</w:t>
             </w:r>
           </w:p>
         </w:tc>
@@ -1263,7 +1324,7 @@
       <w:tr>
         <w:tc>
           <w:tcPr>
-            <w:tcW w:type="dxa" w:w="3024"/>
+            <w:tcW w:type="dxa" w:w="2448"/>
           </w:tcPr>
           <w:p>
             <w:r>
@@ -1276,20 +1337,94 @@
         </w:tc>
         <w:tc>
           <w:tcPr>
-            <w:tcW w:type="dxa" w:w="5904"/>
+            <w:tcW w:type="dxa" w:w="6480"/>
           </w:tcPr>
           <w:p>
             <w:r>
               <w:rPr>
                 <w:sz w:val="18"/>
               </w:rPr>
-              <w:t>Baseline copy of the deployed generator, committed unmodified.</w:t>
+              <w:t>Rewired: fetch → store → render, with tone badges on each card.</w:t>
+            </w:r>
+          </w:p>
+        </w:tc>
+      </w:tr>
+      <w:tr>
+        <w:tc>
+          <w:tcPr>
+            <w:tcW w:type="dxa" w:w="2448"/>
+          </w:tcPr>
+          <w:p>
+            <w:r>
+              <w:rPr>
+                <w:sz w:val="18"/>
+              </w:rPr>
+              <w:t>README.md</w:t>
+            </w:r>
+          </w:p>
+        </w:tc>
+        <w:tc>
+          <w:tcPr>
+            <w:tcW w:type="dxa" w:w="6480"/>
+          </w:tcPr>
+          <w:p>
+            <w:r>
+              <w:rPr>
+                <w:sz w:val="18"/>
+              </w:rPr>
+              <w:t>Includes the definition, the agreement table, and the case against off-the-shelf sentiment models.</w:t>
+            </w:r>
+          </w:p>
+        </w:tc>
+      </w:tr>
+      <w:tr>
+        <w:tc>
+          <w:tcPr>
+            <w:tcW w:type="dxa" w:w="2448"/>
+          </w:tcPr>
+          <w:p>
+            <w:r>
+              <w:rPr>
+                <w:sz w:val="18"/>
+              </w:rPr>
+              <w:t>update_news.sh</w:t>
+            </w:r>
+          </w:p>
+        </w:tc>
+        <w:tc>
+          <w:tcPr>
+            <w:tcW w:type="dxa" w:w="6480"/>
+          </w:tcPr>
+          <w:p>
+            <w:r>
+              <w:rPr>
+                <w:sz w:val="18"/>
+              </w:rPr>
+              <w:t>Adds venv activation, the API key env file, and a labelling pass that is non-fatal — a labelling failure must not take the site down.</w:t>
             </w:r>
           </w:p>
         </w:tc>
       </w:tr>
     </w:tbl>
     <w:p/>
+    <w:p>
+      <w:pPr>
+        <w:pStyle w:val="Heading2"/>
+      </w:pPr>
+      <w:r>
+        <w:t>8.1  Testing</w:t>
+      </w:r>
+    </w:p>
+    <w:p>
+      <w:r>
+        <w:t>The pipeline was run end to end locally against a copy of the corpus with synthetic labels, so the whole chain was exercised before any API key was involved: 26 stories fetched, 25 stored (the failed-feed card correctly excluded), 51 labels injected, adjudication driven with scripted input, CSVs exported, and the scorer run. Tone badges were confirmed to render.</w:t>
+      </w:r>
+    </w:p>
+    <w:p>
+      <w:r>
+        <w:t>That test found a real bug. save_labels() deletes an article's existing labels for a labeller before inserting — correct for the model, which emits every entity in one response, but wrong for the human, who adjudicates one entity at a time. Where the sample contained two entities from the same article, recording the second silently erased the first: ten adjudications, eight rows stored. Fixed by adding upsert_label() for single-pair writes. This is exactly the class of bug that would have quietly corrupted the agreement number rather than announcing itself.</w:t>
+      </w:r>
+    </w:p>
     <w:p>
       <w:pPr>
         <w:pStyle w:val="Heading1"/>
@@ -1332,15 +1467,169 @@
         <w:rPr>
           <w:b/>
         </w:rPr>
-        <w:t xml:space="preserve">Open decision: </w:t>
+        <w:t xml:space="preserve">Also needed from you: </w:t>
       </w:r>
       <w:r>
-        <w:t>whether to label on headline plus standfirst only (cheap, self-contained, but thinner evidence), or to fetch article bodies from the source links (faithful to the full rubric, but adds scraping, fragility, and a slower cron). Recommendation is the former, with the rubric explicitly scoped to the evidence actually available.</w:t>
+        <w:t>an Anthropic API key, to be placed in /etc/kenya-news.env on the VM (root-owned, chmod 600). It is excluded from git.</w:t>
+      </w:r>
+    </w:p>
+    <w:p>
+      <w:pPr>
+        <w:pStyle w:val="Heading2"/>
+      </w:pPr>
+      <w:r>
+        <w:t>9.1  Where the data lives</w:t>
       </w:r>
     </w:p>
     <w:p>
       <w:r>
-        <w:t>Remaining build:</w:t>
+        <w:t>Three places, and it is worth being precise about which is authoritative:</w:t>
+      </w:r>
+    </w:p>
+    <w:tbl>
+      <w:tblPr>
+        <w:tblStyle w:val="TableGrid"/>
+        <w:tblW w:type="auto" w:w="0"/>
+        <w:tblLook w:firstColumn="1" w:firstRow="1" w:lastColumn="0" w:lastRow="0" w:noHBand="0" w:noVBand="1" w:val="04A0"/>
+      </w:tblPr>
+      <w:tblGrid>
+        <w:gridCol w:w="4320"/>
+        <w:gridCol w:w="4320"/>
+      </w:tblGrid>
+      <w:tr>
+        <w:tc>
+          <w:tcPr>
+            <w:tcW w:type="dxa" w:w="3024"/>
+          </w:tcPr>
+          <w:p>
+            <w:r>
+              <w:rPr>
+                <w:b/>
+                <w:sz w:val="18"/>
+              </w:rPr>
+              <w:t>Location</w:t>
+            </w:r>
+          </w:p>
+        </w:tc>
+        <w:tc>
+          <w:tcPr>
+            <w:tcW w:type="dxa" w:w="5904"/>
+          </w:tcPr>
+          <w:p>
+            <w:r>
+              <w:rPr>
+                <w:b/>
+                <w:sz w:val="18"/>
+              </w:rPr>
+              <w:t>What, and whose</w:t>
+            </w:r>
+          </w:p>
+        </w:tc>
+      </w:tr>
+      <w:tr>
+        <w:tc>
+          <w:tcPr>
+            <w:tcW w:type="dxa" w:w="3024"/>
+          </w:tcPr>
+          <w:p>
+            <w:r>
+              <w:rPr>
+                <w:sz w:val="18"/>
+              </w:rPr>
+              <w:t>VM persistent disk</w:t>
+              <w:br/>
+              <w:t>/opt/kenya-news/kenya_news.db</w:t>
+            </w:r>
+          </w:p>
+        </w:tc>
+        <w:tc>
+          <w:tcPr>
+            <w:tcW w:type="dxa" w:w="5904"/>
+          </w:tcPr>
+          <w:p>
+            <w:r>
+              <w:rPr>
+                <w:sz w:val="18"/>
+              </w:rPr>
+              <w:t>The master corpus, once deployed. Your GCP project, Google's infrastructure, in the VM's region. Cron appends to it daily, so it is the only copy that stays current.</w:t>
+            </w:r>
+          </w:p>
+        </w:tc>
+      </w:tr>
+      <w:tr>
+        <w:tc>
+          <w:tcPr>
+            <w:tcW w:type="dxa" w:w="3024"/>
+          </w:tcPr>
+          <w:p>
+            <w:r>
+              <w:rPr>
+                <w:sz w:val="18"/>
+              </w:rPr>
+              <w:t>D:\kenya-daily-brief\</w:t>
+            </w:r>
+          </w:p>
+        </w:tc>
+        <w:tc>
+          <w:tcPr>
+            <w:tcW w:type="dxa" w:w="5904"/>
+          </w:tcPr>
+          <w:p>
+            <w:r>
+              <w:rPr>
+                <w:sz w:val="18"/>
+              </w:rPr>
+              <w:t>The code, under git — authoritative for source. Also currently holds a 25-article database from local testing, which will diverge from the VM once deployed and should be treated as scratch.</w:t>
+            </w:r>
+          </w:p>
+        </w:tc>
+      </w:tr>
+      <w:tr>
+        <w:tc>
+          <w:tcPr>
+            <w:tcW w:type="dxa" w:w="3024"/>
+          </w:tcPr>
+          <w:p>
+            <w:r>
+              <w:rPr>
+                <w:sz w:val="18"/>
+              </w:rPr>
+              <w:t>Anthropic API</w:t>
+            </w:r>
+          </w:p>
+        </w:tc>
+        <w:tc>
+          <w:tcPr>
+            <w:tcW w:type="dxa" w:w="5904"/>
+          </w:tcPr>
+          <w:p>
+            <w:r>
+              <w:rPr>
+                <w:sz w:val="18"/>
+              </w:rPr>
+              <w:t>Headline and standfirst are sent for labelling. Public news text, but it does leave your infrastructure. Nothing else is transmitted.</w:t>
+            </w:r>
+          </w:p>
+        </w:tc>
+      </w:tr>
+    </w:tbl>
+    <w:p/>
+    <w:p>
+      <w:r>
+        <w:t>Recommended split, so no file is authoritative in two places: code flows from D: to the VM, data flows from the VM to D:. Run the hand-check over SSH against the VM's database rather than pulling it down, adjudicating locally, and pushing it back — cron writes to that file every morning, and a push-back would clobber whatever it added. Pull copies down for backup and analysis freely; just do not write to them and send them back.</w:t>
+      </w:r>
+    </w:p>
+    <w:p>
+      <w:r>
+        <w:t>Volume is negligible: roughly 25–30 articles a day, a few megabytes a year.</w:t>
+      </w:r>
+    </w:p>
+    <w:p>
+      <w:pPr>
+        <w:pStyle w:val="Heading2"/>
+      </w:pPr>
+      <w:r>
+        <w:t>9.2  Remaining</w:t>
       </w:r>
     </w:p>
     <w:p>
@@ -1348,7 +1637,7 @@
         <w:pStyle w:val="ListBullet"/>
       </w:pPr>
       <w:r>
-        <w:t>store.py — SQLite article and label storage (must come first)</w:t>
+        <w:t>Deploy the reviewed code to /opt/kenya-news and create the venv</w:t>
       </w:r>
     </w:p>
     <w:p>
@@ -1356,7 +1645,7 @@
         <w:pStyle w:val="ListBullet"/>
       </w:pPr>
       <w:r>
-        <w:t>label.py — Anthropic labelling against the frozen rubric, structured output</w:t>
+        <w:t>Run label.py against the corpus once the key is in place</w:t>
       </w:r>
     </w:p>
     <w:p>
@@ -1364,7 +1653,7 @@
         <w:pStyle w:val="ListBullet"/>
       </w:pPr>
       <w:r>
-        <w:t>handcheck.py — blind adjudication CLI for the 50-pair sample</w:t>
+        <w:t>Accumulate enough articles to draw 50 (article, entity) pairs — about two days</w:t>
       </w:r>
     </w:p>
     <w:p>
@@ -1372,7 +1661,7 @@
         <w:pStyle w:val="ListBullet"/>
       </w:pPr>
       <w:r>
-        <w:t>build_news.py — integrate fetch → store → label → render</w:t>
+        <w:t>Run the blind hand-check and fill the agreement table in README.md</w:t>
       </w:r>
     </w:p>
     <w:p>
@@ -1380,23 +1669,7 @@
         <w:pStyle w:val="ListBullet"/>
       </w:pPr>
       <w:r>
-        <w:t>Display tone in the rendered cards</w:t>
-      </w:r>
-    </w:p>
-    <w:p>
-      <w:pPr>
-        <w:pStyle w:val="ListBullet"/>
-      </w:pPr>
-      <w:r>
-        <w:t>Virtual environment, requirements.txt, API key placement, update_news.sh changes</w:t>
-      </w:r>
-    </w:p>
-    <w:p>
-      <w:pPr>
-        <w:pStyle w:val="ListBullet"/>
-      </w:pPr>
-      <w:r>
-        <w:t>Deploy back to the VM once reviewed</w:t>
+        <w:t>Consider a second adjudicator, which would give a human–human ceiling</w:t>
       </w:r>
     </w:p>
     <w:p/>

</xml_diff>

<commit_message>
Log deployment, first labelling run, and go-live
</commit_message>
<xml_diff>
--- a/docs/PROJECT_LOG.docx
+++ b/docs/PROJECT_LOG.docx
@@ -1435,42 +1435,7 @@
     </w:p>
     <w:p>
       <w:r>
-        <w:rPr>
-          <w:b/>
-        </w:rPr>
-        <w:t xml:space="preserve">Blocked on you: </w:t>
-      </w:r>
-      <w:r>
-        <w:t>gcloud authentication. Run in the Claude prompt:</w:t>
-      </w:r>
-    </w:p>
-    <w:p>
-      <w:pPr>
-        <w:spacing w:after="120"/>
-        <w:ind w:left="432"/>
-      </w:pPr>
-      <w:r>
-        <w:rPr>
-          <w:rFonts w:ascii="Consolas" w:hAnsi="Consolas"/>
-          <w:sz w:val="18"/>
-        </w:rPr>
-        <w:t>! /home/mnm/google-cloud-sdk/bin/gcloud auth login --no-launch-browser</w:t>
-      </w:r>
-    </w:p>
-    <w:p>
-      <w:r>
-        <w:t>Until this is done, files can only move between the VM and the working copy by copy-paste, and changes cannot be tested against the live box.</w:t>
-      </w:r>
-    </w:p>
-    <w:p>
-      <w:r>
-        <w:rPr>
-          <w:b/>
-        </w:rPr>
-        <w:t xml:space="preserve">Also needed from you: </w:t>
-      </w:r>
-      <w:r>
-        <w:t>an Anthropic API key, to be placed in /etc/kenya-news.env on the VM (root-owned, chmod 600). It is excluded from git.</w:t>
+        <w:t>Both prerequisites are now complete: gcloud is authenticated against project kenyan-ai-news-summary, and the API key is in /etc/kenya-news.env on the VM. The system is deployed and live — see section 10.</w:t>
       </w:r>
     </w:p>
     <w:p>
@@ -1637,7 +1602,7 @@
         <w:pStyle w:val="ListBullet"/>
       </w:pPr>
       <w:r>
-        <w:t>Deploy the reviewed code to /opt/kenya-news and create the venv</w:t>
+        <w:t>Accumulate enough articles to draw 50 (article, entity) pairs — 30 exist, so one more 06:30 cron run should clear it</w:t>
       </w:r>
     </w:p>
     <w:p>
@@ -1645,7 +1610,7 @@
         <w:pStyle w:val="ListBullet"/>
       </w:pPr>
       <w:r>
-        <w:t>Run label.py against the corpus once the key is in place</w:t>
+        <w:t>Run the blind hand-check (handcheck.py, over an interactive SSH session)</w:t>
       </w:r>
     </w:p>
     <w:p>
@@ -1653,15 +1618,7 @@
         <w:pStyle w:val="ListBullet"/>
       </w:pPr>
       <w:r>
-        <w:t>Accumulate enough articles to draw 50 (article, entity) pairs — about two days</w:t>
-      </w:r>
-    </w:p>
-    <w:p>
-      <w:pPr>
-        <w:pStyle w:val="ListBullet"/>
-      </w:pPr>
-      <w:r>
-        <w:t>Run the blind hand-check and fill the agreement table in README.md</w:t>
+        <w:t>Fill the agreement table in README.md with the measured figures</w:t>
       </w:r>
     </w:p>
     <w:p>
@@ -1672,6 +1629,202 @@
         <w:t>Consider a second adjudicator, which would give a human–human ceiling</w:t>
       </w:r>
     </w:p>
+    <w:p>
+      <w:pPr>
+        <w:pStyle w:val="Heading1"/>
+      </w:pPr>
+      <w:r>
+        <w:t>10. Deployment and first labelling run</w:t>
+      </w:r>
+    </w:p>
+    <w:p>
+      <w:r>
+        <w:t>Deployed to kenya-news-vm (us-west1-a, e2-micro, free tier). The live files were backed up first as *.bak-20260914-1244, so the previous version can be restored with three cp commands. Two environment problems surfaced and were fixed: the Ubuntu image was minimized and had no ensurepip, so python3.14-venv had to be installed before a virtual environment could be created; and the API key file had been placed root-owned at chmod 600, which the cron job — running under the user crontab, not root's — could not read, so labelling would have silently skipped every morning. Ownership was moved to the cron user.</w:t>
+      </w:r>
+    </w:p>
+    <w:p>
+      <w:r>
+        <w:t>Two code bugs were found by running against the real API, both of which would have failed quietly rather than loudly:</w:t>
+      </w:r>
+    </w:p>
+    <w:p>
+      <w:pPr>
+        <w:pStyle w:val="ListBullet"/>
+      </w:pPr>
+      <w:r>
+        <w:t>An errored labelling attempt permanently retired an article from the queue, because the pending query excluded any article with any prior run record. All 20 articles that failed on a billing error would never have been retried. Only 'ok' and 'refused' are final now.</w:t>
+      </w:r>
+    </w:p>
+    <w:p>
+      <w:pPr>
+        <w:pStyle w:val="ListBullet"/>
+      </w:pPr>
+      <w:r>
+        <w:t>The output schema used maxItems on an array, which structured outputs rejects. The three-entity cap moved to the prompt and a client-side trim.</w:t>
+      </w:r>
+    </w:p>
+    <w:p>
+      <w:pPr>
+        <w:pStyle w:val="Heading2"/>
+      </w:pPr>
+      <w:r>
+        <w:t>10.1  First results</w:t>
+      </w:r>
+    </w:p>
+    <w:tbl>
+      <w:tblPr>
+        <w:tblStyle w:val="TableGrid"/>
+        <w:tblW w:type="auto" w:w="0"/>
+        <w:tblLook w:firstColumn="1" w:firstRow="1" w:lastColumn="0" w:lastRow="0" w:noHBand="0" w:noVBand="1" w:val="04A0"/>
+      </w:tblPr>
+      <w:tblGrid>
+        <w:gridCol w:w="4320"/>
+        <w:gridCol w:w="4320"/>
+      </w:tblGrid>
+      <w:tr>
+        <w:tc>
+          <w:tcPr>
+            <w:tcW w:type="dxa" w:w="3168"/>
+          </w:tcPr>
+          <w:p>
+            <w:r>
+              <w:rPr>
+                <w:b/>
+                <w:sz w:val="18"/>
+              </w:rPr>
+              <w:t>Articles labelled</w:t>
+            </w:r>
+          </w:p>
+        </w:tc>
+        <w:tc>
+          <w:tcPr>
+            <w:tcW w:type="dxa" w:w="5760"/>
+          </w:tcPr>
+          <w:p>
+            <w:r>
+              <w:rPr>
+                <w:sz w:val="18"/>
+              </w:rPr>
+              <w:t>20, producing 30 (article, entity) pairs, in 84 seconds</w:t>
+            </w:r>
+          </w:p>
+        </w:tc>
+      </w:tr>
+      <w:tr>
+        <w:tc>
+          <w:tcPr>
+            <w:tcW w:type="dxa" w:w="3168"/>
+          </w:tcPr>
+          <w:p>
+            <w:r>
+              <w:rPr>
+                <w:b/>
+                <w:sz w:val="18"/>
+              </w:rPr>
+              <w:t>Tone distribution</w:t>
+            </w:r>
+          </w:p>
+        </w:tc>
+        <w:tc>
+          <w:tcPr>
+            <w:tcW w:type="dxa" w:w="5760"/>
+          </w:tcPr>
+          <w:p>
+            <w:r>
+              <w:rPr>
+                <w:sz w:val="18"/>
+              </w:rPr>
+              <w:t>20.0% negative · 56.7% neutral · 23.3% positive</w:t>
+            </w:r>
+          </w:p>
+        </w:tc>
+      </w:tr>
+      <w:tr>
+        <w:tc>
+          <w:tcPr>
+            <w:tcW w:type="dxa" w:w="3168"/>
+          </w:tcPr>
+          <w:p>
+            <w:r>
+              <w:rPr>
+                <w:b/>
+                <w:sz w:val="18"/>
+              </w:rPr>
+              <w:t>Articles given zero labels</w:t>
+            </w:r>
+          </w:p>
+        </w:tc>
+        <w:tc>
+          <w:tcPr>
+            <w:tcW w:type="dxa" w:w="5760"/>
+          </w:tcPr>
+          <w:p>
+            <w:r>
+              <w:rPr>
+                <w:sz w:val="18"/>
+              </w:rPr>
+              <w:t>3</w:t>
+            </w:r>
+          </w:p>
+        </w:tc>
+      </w:tr>
+      <w:tr>
+        <w:tc>
+          <w:tcPr>
+            <w:tcW w:type="dxa" w:w="3168"/>
+          </w:tcPr>
+          <w:p>
+            <w:r>
+              <w:rPr>
+                <w:b/>
+                <w:sz w:val="18"/>
+              </w:rPr>
+              <w:t>Live</w:t>
+            </w:r>
+          </w:p>
+        </w:tc>
+        <w:tc>
+          <w:tcPr>
+            <w:tcW w:type="dxa" w:w="5760"/>
+          </w:tcPr>
+          <w:p>
+            <w:r>
+              <w:rPr>
+                <w:sz w:val="18"/>
+              </w:rPr>
+              <w:t>Published to /var/www/html/index.html, 17 badged cards</w:t>
+            </w:r>
+          </w:p>
+        </w:tc>
+      </w:tr>
+    </w:tbl>
+    <w:p/>
+    <w:p>
+      <w:r>
+        <w:t>The neutral share sitting above 50% is the first indication that the labeller is scoring stance rather than event valence, which is what the rubric spends R1, R2 and R3 trying to enforce.</w:t>
+      </w:r>
+    </w:p>
+    <w:p>
+      <w:r>
+        <w:t>Three cases chosen in advance as tests of the rules all came back correct: “Sifuna accuses Ruto of undermining devolution” returned neutral toward both parties (R2 — the verb carries the attribution); “Ruto's Tata Chemicals tantrum spooks investors” returned negative toward Ruto at 0.95, citing the headline (R9 — “tantrum” is the publication's word); and “Babu Owino pledges good service” returned neutral (R6 — an attributed promise, not one the text adopts).</w:t>
+      </w:r>
+    </w:p>
+    <w:p>
+      <w:r>
+        <w:t>More telling, three articles were correctly given no labels at all, including “Woman killed in hit and run at Jacaranda rally” and “16 injured, vehicles damaged as Golbo protests force suspension of land registration”. Both are violent events with no blame attributed and no named entity to attach it to (R1, R5). An off-the-shelf review-trained classifier would score both strongly negative. That is the argument of the README's final section, now demonstrated rather than asserted.</w:t>
+      </w:r>
+    </w:p>
+    <w:p>
+      <w:r>
+        <w:rPr>
+          <w:b/>
+        </w:rPr>
+        <w:t xml:space="preserve">These three canaries are not a measurement. </w:t>
+      </w:r>
+      <w:r>
+        <w:t>They were hand-picked in advance, and three cases chosen by the person who wrote the rules prove only that the rules are implementable. The agreement table in README.md stays marked pending until 50 pairs have been adjudicated blind.</w:t>
+      </w:r>
+    </w:p>
     <w:p/>
     <w:p>
       <w:r>
@@ -1680,7 +1833,7 @@
           <w:color w:val="6B7280"/>
           <w:sz w:val="18"/>
         </w:rPr>
-        <w:t>Nothing on the live VM has been modified. All work so far is local to D:\kenya-daily-brief and under git.</w:t>
+        <w:t>Live at http://8.231.166.151/ · working copy D:\kenya-daily-brief under git · previous version recoverable from *.bak-20260914-1244 on the VM.</w:t>
       </w:r>
     </w:p>
     <w:sectPr>

</xml_diff>